<commit_message>
Updated features and UI
</commit_message>
<xml_diff>
--- a/templates/Volo TPA.docx
+++ b/templates/Volo TPA.docx
@@ -176,27 +176,7 @@
           <w:color w:val="000000"/>
           <w:sz w:val="24"/>
         </w:rPr>
-        <w:t>{</w:t>
-      </w:r>
-      <w:proofErr w:type="spellStart"/>
-      <w:r>
-        <w:rPr>
-          <w:rFonts w:ascii="Arial" w:eastAsia="Arial" w:hAnsi="Arial"/>
-          <w:b/>
-          <w:color w:val="000000"/>
-          <w:sz w:val="24"/>
-        </w:rPr>
-        <w:t>insurancecompany</w:t>
-      </w:r>
-      <w:proofErr w:type="spellEnd"/>
-      <w:r>
-        <w:rPr>
-          <w:rFonts w:ascii="Arial" w:eastAsia="Arial" w:hAnsi="Arial"/>
-          <w:b/>
-          <w:color w:val="000000"/>
-          <w:sz w:val="24"/>
-        </w:rPr>
-        <w:t>}</w:t>
+        <w:t>{insurancecompany}</w:t>
       </w:r>
       <w:r>
         <w:rPr>
@@ -496,25 +476,7 @@
                 <w:sz w:val="24"/>
                 <w:szCs w:val="24"/>
               </w:rPr>
-              <w:t>{</w:t>
-            </w:r>
-            <w:proofErr w:type="spellStart"/>
-            <w:r>
-              <w:rPr>
-                <w:rFonts w:asciiTheme="minorHAnsi" w:hAnsiTheme="minorHAnsi" w:cstheme="minorHAnsi"/>
-                <w:sz w:val="24"/>
-                <w:szCs w:val="24"/>
-              </w:rPr>
-              <w:t>patientname</w:t>
-            </w:r>
-            <w:proofErr w:type="spellEnd"/>
-            <w:r>
-              <w:rPr>
-                <w:rFonts w:asciiTheme="minorHAnsi" w:hAnsiTheme="minorHAnsi" w:cstheme="minorHAnsi"/>
-                <w:sz w:val="24"/>
-                <w:szCs w:val="24"/>
-              </w:rPr>
-              <w:t>}</w:t>
+              <w:t>{patientname}</w:t>
             </w:r>
           </w:p>
         </w:tc>
@@ -549,25 +511,7 @@
                 <w:sz w:val="24"/>
                 <w:szCs w:val="24"/>
               </w:rPr>
-              <w:t>{</w:t>
-            </w:r>
-            <w:proofErr w:type="spellStart"/>
-            <w:r>
-              <w:rPr>
-                <w:rFonts w:asciiTheme="minorHAnsi" w:hAnsiTheme="minorHAnsi" w:cstheme="minorHAnsi"/>
-                <w:sz w:val="24"/>
-                <w:szCs w:val="24"/>
-              </w:rPr>
-              <w:t>patientname</w:t>
-            </w:r>
-            <w:proofErr w:type="spellEnd"/>
-            <w:r>
-              <w:rPr>
-                <w:rFonts w:asciiTheme="minorHAnsi" w:hAnsiTheme="minorHAnsi" w:cstheme="minorHAnsi"/>
-                <w:sz w:val="24"/>
-                <w:szCs w:val="24"/>
-              </w:rPr>
-              <w:t>}</w:t>
+              <w:t>{patientname}</w:t>
             </w:r>
           </w:p>
         </w:tc>
@@ -1186,31 +1130,7 @@
                 <w:szCs w:val="24"/>
                 <w:lang w:val="en-US"/>
               </w:rPr>
-              <w:t>{</w:t>
-            </w:r>
-            <w:proofErr w:type="spellStart"/>
-            <w:r>
-              <w:rPr>
-                <w:rFonts w:asciiTheme="minorHAnsi" w:hAnsiTheme="minorHAnsi" w:cstheme="minorHAnsi"/>
-                <w:b w:val="0"/>
-                <w:bCs w:val="0"/>
-                <w:sz w:val="24"/>
-                <w:szCs w:val="24"/>
-                <w:lang w:val="en-US"/>
-              </w:rPr>
-              <w:t>policyno</w:t>
-            </w:r>
-            <w:proofErr w:type="spellEnd"/>
-            <w:r>
-              <w:rPr>
-                <w:rFonts w:asciiTheme="minorHAnsi" w:hAnsiTheme="minorHAnsi" w:cstheme="minorHAnsi"/>
-                <w:b w:val="0"/>
-                <w:bCs w:val="0"/>
-                <w:sz w:val="24"/>
-                <w:szCs w:val="24"/>
-                <w:lang w:val="en-US"/>
-              </w:rPr>
-              <w:t>}</w:t>
+              <w:t>{policyno}</w:t>
             </w:r>
           </w:p>
         </w:tc>
@@ -1280,27 +1200,7 @@
                 <w:sz w:val="24"/>
                 <w:szCs w:val="24"/>
               </w:rPr>
-              <w:t>{</w:t>
-            </w:r>
-            <w:proofErr w:type="spellStart"/>
-            <w:r>
-              <w:rPr>
-                <w:rFonts w:asciiTheme="minorHAnsi" w:hAnsiTheme="minorHAnsi" w:cstheme="minorHAnsi"/>
-                <w:bCs/>
-                <w:sz w:val="24"/>
-                <w:szCs w:val="24"/>
-              </w:rPr>
-              <w:t>claimno</w:t>
-            </w:r>
-            <w:proofErr w:type="spellEnd"/>
-            <w:r>
-              <w:rPr>
-                <w:rFonts w:asciiTheme="minorHAnsi" w:hAnsiTheme="minorHAnsi" w:cstheme="minorHAnsi"/>
-                <w:bCs/>
-                <w:sz w:val="24"/>
-                <w:szCs w:val="24"/>
-              </w:rPr>
-              <w:t>}</w:t>
+              <w:t>{claimno}</w:t>
             </w:r>
           </w:p>
         </w:tc>
@@ -1548,25 +1448,7 @@
                 <w:sz w:val="24"/>
                 <w:szCs w:val="24"/>
               </w:rPr>
-              <w:t>{</w:t>
-            </w:r>
-            <w:proofErr w:type="spellStart"/>
-            <w:r>
-              <w:rPr>
-                <w:rFonts w:asciiTheme="minorHAnsi" w:hAnsiTheme="minorHAnsi" w:cstheme="minorHAnsi"/>
-                <w:sz w:val="24"/>
-                <w:szCs w:val="24"/>
-              </w:rPr>
-              <w:t>doa</w:t>
-            </w:r>
-            <w:proofErr w:type="spellEnd"/>
-            <w:r>
-              <w:rPr>
-                <w:rFonts w:asciiTheme="minorHAnsi" w:hAnsiTheme="minorHAnsi" w:cstheme="minorHAnsi"/>
-                <w:sz w:val="24"/>
-                <w:szCs w:val="24"/>
-              </w:rPr>
-              <w:t>}</w:t>
+              <w:t>{doa}</w:t>
             </w:r>
           </w:p>
         </w:tc>
@@ -1634,33 +1516,7 @@
                 <w:sz w:val="24"/>
                 <w:szCs w:val="24"/>
               </w:rPr>
-              <w:t>{</w:t>
-            </w:r>
-            <w:proofErr w:type="spellStart"/>
-            <w:r>
-              <w:rPr>
-                <w:rFonts w:asciiTheme="minorHAnsi" w:hAnsiTheme="minorHAnsi" w:cstheme="minorHAnsi"/>
-                <w:sz w:val="24"/>
-                <w:szCs w:val="24"/>
-              </w:rPr>
-              <w:t>do</w:t>
-            </w:r>
-            <w:r>
-              <w:rPr>
-                <w:rFonts w:asciiTheme="minorHAnsi" w:hAnsiTheme="minorHAnsi" w:cstheme="minorHAnsi"/>
-                <w:sz w:val="24"/>
-                <w:szCs w:val="24"/>
-              </w:rPr>
-              <w:t>d</w:t>
-            </w:r>
-            <w:proofErr w:type="spellEnd"/>
-            <w:r>
-              <w:rPr>
-                <w:rFonts w:asciiTheme="minorHAnsi" w:hAnsiTheme="minorHAnsi" w:cstheme="minorHAnsi"/>
-                <w:sz w:val="24"/>
-                <w:szCs w:val="24"/>
-              </w:rPr>
-              <w:t>}</w:t>
+              <w:t>-</w:t>
             </w:r>
           </w:p>
         </w:tc>
@@ -1828,39 +1684,7 @@
                 <w:rFonts w:ascii="Calibri" w:eastAsia="Calibri" w:hAnsi="Calibri"/>
                 <w:color w:val="000000"/>
               </w:rPr>
-              <w:t>Pre-Auth Details(</w:t>
-            </w:r>
-            <w:proofErr w:type="spellStart"/>
-            <w:r>
-              <w:rPr>
-                <w:rFonts w:ascii="Calibri" w:eastAsia="Calibri" w:hAnsi="Calibri"/>
-                <w:color w:val="000000"/>
-              </w:rPr>
-              <w:t>Amount,Estimates,Medical</w:t>
-            </w:r>
-            <w:proofErr w:type="spellEnd"/>
-            <w:r>
-              <w:rPr>
-                <w:rFonts w:ascii="Calibri" w:eastAsia="Calibri" w:hAnsi="Calibri"/>
-                <w:color w:val="000000"/>
-              </w:rPr>
-              <w:t xml:space="preserve"> History </w:t>
-            </w:r>
-            <w:proofErr w:type="spellStart"/>
-            <w:r>
-              <w:rPr>
-                <w:rFonts w:ascii="Calibri" w:eastAsia="Calibri" w:hAnsi="Calibri"/>
-                <w:color w:val="000000"/>
-              </w:rPr>
-              <w:t>etc</w:t>
-            </w:r>
-            <w:proofErr w:type="spellEnd"/>
-            <w:r>
-              <w:rPr>
-                <w:rFonts w:ascii="Calibri" w:eastAsia="Calibri" w:hAnsi="Calibri"/>
-                <w:color w:val="000000"/>
-              </w:rPr>
-              <w:t>)</w:t>
+              <w:t>Pre-Auth Details(Amount,Estimates,Medical History etc)</w:t>
             </w:r>
           </w:p>
         </w:tc>
@@ -2084,18 +1908,8 @@
                 <w:sz w:val="24"/>
                 <w:szCs w:val="24"/>
               </w:rPr>
-              <w:t>{</w:t>
-            </w:r>
-            <w:proofErr w:type="spellStart"/>
-            <w:r>
-              <w:rPr>
-                <w:rFonts w:asciiTheme="minorHAnsi" w:hAnsiTheme="minorHAnsi" w:cstheme="minorHAnsi"/>
-                <w:sz w:val="24"/>
-                <w:szCs w:val="24"/>
-              </w:rPr>
-              <w:t>hospitalname</w:t>
-            </w:r>
-            <w:proofErr w:type="spellEnd"/>
+              <w:t>{hospitalname</w:t>
+            </w:r>
             <w:r>
               <w:rPr>
                 <w:rFonts w:asciiTheme="minorHAnsi" w:hAnsiTheme="minorHAnsi" w:cstheme="minorHAnsi"/>
@@ -2110,25 +1924,7 @@
                 <w:sz w:val="24"/>
                 <w:szCs w:val="24"/>
               </w:rPr>
-              <w:t>{</w:t>
-            </w:r>
-            <w:proofErr w:type="spellStart"/>
-            <w:r>
-              <w:rPr>
-                <w:rFonts w:asciiTheme="minorHAnsi" w:hAnsiTheme="minorHAnsi" w:cstheme="minorHAnsi"/>
-                <w:sz w:val="24"/>
-                <w:szCs w:val="24"/>
-              </w:rPr>
-              <w:t>hospitallocation</w:t>
-            </w:r>
-            <w:proofErr w:type="spellEnd"/>
-            <w:r>
-              <w:rPr>
-                <w:rFonts w:asciiTheme="minorHAnsi" w:hAnsiTheme="minorHAnsi" w:cstheme="minorHAnsi"/>
-                <w:sz w:val="24"/>
-                <w:szCs w:val="24"/>
-              </w:rPr>
-              <w:t>}</w:t>
+              <w:t>{hospitallocation}</w:t>
             </w:r>
           </w:p>
         </w:tc>
@@ -3219,43 +3015,7 @@
           <w:sz w:val="24"/>
           <w:szCs w:val="24"/>
         </w:rPr>
-        <w:t>Claim verification by ASPIRA -– We visited the {</w:t>
-      </w:r>
-      <w:proofErr w:type="spellStart"/>
-      <w:r>
-        <w:rPr>
-          <w:rFonts w:asciiTheme="minorHAnsi" w:hAnsiTheme="minorHAnsi" w:cstheme="minorHAnsi"/>
-          <w:sz w:val="24"/>
-          <w:szCs w:val="24"/>
-        </w:rPr>
-        <w:t>hospitalname</w:t>
-      </w:r>
-      <w:proofErr w:type="spellEnd"/>
-      <w:r>
-        <w:rPr>
-          <w:rFonts w:asciiTheme="minorHAnsi" w:hAnsiTheme="minorHAnsi" w:cstheme="minorHAnsi"/>
-          <w:sz w:val="24"/>
-          <w:szCs w:val="24"/>
-        </w:rPr>
-        <w:t>}, {</w:t>
-      </w:r>
-      <w:proofErr w:type="spellStart"/>
-      <w:r>
-        <w:rPr>
-          <w:rFonts w:asciiTheme="minorHAnsi" w:hAnsiTheme="minorHAnsi" w:cstheme="minorHAnsi"/>
-          <w:sz w:val="24"/>
-          <w:szCs w:val="24"/>
-        </w:rPr>
-        <w:t>hospitallocation</w:t>
-      </w:r>
-      <w:proofErr w:type="spellEnd"/>
-      <w:r>
-        <w:rPr>
-          <w:rFonts w:asciiTheme="minorHAnsi" w:hAnsiTheme="minorHAnsi" w:cstheme="minorHAnsi"/>
-          <w:sz w:val="24"/>
-          <w:szCs w:val="24"/>
-        </w:rPr>
-        <w:t>}</w:t>
+        <w:t>Claim verification by ASPIRA -– We visited the {hospitalname}, {hospitallocation}</w:t>
       </w:r>
       <w:r>
         <w:rPr>
@@ -3271,25 +3031,7 @@
           <w:sz w:val="24"/>
           <w:szCs w:val="24"/>
         </w:rPr>
-        <w:t>and enquired about the patient they confirmed the admission of the patient. Patient was admitted on {</w:t>
-      </w:r>
-      <w:proofErr w:type="spellStart"/>
-      <w:r>
-        <w:rPr>
-          <w:rFonts w:asciiTheme="minorHAnsi" w:hAnsiTheme="minorHAnsi" w:cstheme="minorHAnsi"/>
-          <w:sz w:val="24"/>
-          <w:szCs w:val="24"/>
-        </w:rPr>
-        <w:t>doa</w:t>
-      </w:r>
-      <w:proofErr w:type="spellEnd"/>
-      <w:r>
-        <w:rPr>
-          <w:rFonts w:asciiTheme="minorHAnsi" w:hAnsiTheme="minorHAnsi" w:cstheme="minorHAnsi"/>
-          <w:sz w:val="24"/>
-          <w:szCs w:val="24"/>
-        </w:rPr>
-        <w:t>}</w:t>
+        <w:t>and enquired about the patient they confirmed the admission of the patient. Patient was admitted on {doa}</w:t>
       </w:r>
       <w:r>
         <w:rPr>
@@ -3307,7 +3049,6 @@
         </w:rPr>
         <w:t xml:space="preserve">and was diagnosed with </w:t>
       </w:r>
-      <w:proofErr w:type="gramStart"/>
       <w:r>
         <w:rPr>
           <w:rFonts w:asciiTheme="minorHAnsi" w:hAnsiTheme="minorHAnsi" w:cstheme="minorHAnsi"/>
@@ -3334,7 +3075,6 @@
         </w:rPr>
         <w:t>(</w:t>
       </w:r>
-      <w:proofErr w:type="gramEnd"/>
       <w:r>
         <w:rPr>
           <w:rFonts w:asciiTheme="minorHAnsi" w:hAnsiTheme="minorHAnsi" w:cstheme="minorHAnsi"/>
@@ -3769,25 +3509,7 @@
                 <w:sz w:val="24"/>
                 <w:szCs w:val="24"/>
               </w:rPr>
-              <w:t>{</w:t>
-            </w:r>
-            <w:proofErr w:type="spellStart"/>
-            <w:r>
-              <w:rPr>
-                <w:rFonts w:asciiTheme="minorHAnsi" w:hAnsiTheme="minorHAnsi" w:cstheme="minorHAnsi"/>
-                <w:sz w:val="24"/>
-                <w:szCs w:val="24"/>
-              </w:rPr>
-              <w:t>hospitallocation</w:t>
-            </w:r>
-            <w:proofErr w:type="spellEnd"/>
-            <w:r>
-              <w:rPr>
-                <w:rFonts w:asciiTheme="minorHAnsi" w:hAnsiTheme="minorHAnsi" w:cstheme="minorHAnsi"/>
-                <w:sz w:val="24"/>
-                <w:szCs w:val="24"/>
-              </w:rPr>
-              <w:t>}</w:t>
+              <w:t>{hospitallocation}</w:t>
             </w:r>
           </w:p>
         </w:tc>

</xml_diff>